<commit_message>
Refresh the user and install guides for the three-cohort app
The guides were built from screenshots of the old two-source sidebar and six
pages, so they documented an interface that no longer exists.

- capture_screens reads cohort labels from src.app.utils.SOURCES instead of
  restating them, and captures the Comparaison page. Clicking by exact text
  meant a sidebar rewording silently screenshotted the wrong cohort.
- 25 screenshots recaptured across all three cohorts.
- User guide: "three cohorts" section explaining that the two simulated ones
  are different cohorts, the cohort x variables selector, and a new section 9
  on the Comparaison page.
- Install guide: the matched cohort seeding step, the third database, and
  train_all for the four models.
- Ignore Office lock files and archives.

Co-Authored-By: Claude Opus 5 (1M context) <noreply@anthropic.com>
Claude-Session: https://claude.ai/code/session_017jcSZYdWo8hWwo9qMJPR6x
</commit_message>
<xml_diff>
--- a/docs/Guide_Installation.docx
+++ b/docs/Guide_Installation.docx
@@ -922,6 +922,61 @@
     </w:p>
     <w:p>
       <w:pPr>
+        <w:spacing w:after="40"/>
+        <w:ind w:left="283"/>
+      </w:pPr>
+      <w:r>
+        <w:rPr>
+          <w:rFonts w:ascii="Consolas" w:hAnsi="Consolas"/>
+          <w:color w:val="333333"/>
+          <w:sz w:val="20"/>
+        </w:rPr>
+      </w:r>
+    </w:p>
+    <w:p>
+      <w:pPr>
+        <w:spacing w:after="40"/>
+        <w:ind w:left="283"/>
+      </w:pPr>
+      <w:r>
+        <w:rPr>
+          <w:rFonts w:ascii="Consolas" w:hAnsi="Consolas"/>
+          <w:color w:val="333333"/>
+          <w:sz w:val="20"/>
+        </w:rPr>
+        <w:t># Cohorte simulée *appariée* sur TDBRAIN (132 patients, 26 canaux + ECG),</w:t>
+      </w:r>
+    </w:p>
+    <w:p>
+      <w:pPr>
+        <w:spacing w:after="40"/>
+        <w:ind w:left="283"/>
+      </w:pPr>
+      <w:r>
+        <w:rPr>
+          <w:rFonts w:ascii="Consolas" w:hAnsi="Consolas"/>
+          <w:color w:val="333333"/>
+          <w:sz w:val="20"/>
+        </w:rPr>
+        <w:t># nécessaire aux deux modèles simulés de la comparaison 2x2 :</w:t>
+      </w:r>
+    </w:p>
+    <w:p>
+      <w:pPr>
+        <w:spacing w:after="40"/>
+        <w:ind w:left="283"/>
+      </w:pPr>
+      <w:r>
+        <w:rPr>
+          <w:rFonts w:ascii="Consolas" w:hAnsi="Consolas"/>
+          <w:color w:val="333333"/>
+          <w:sz w:val="20"/>
+        </w:rPr>
+        <w:t>python -m src.data.tdbrain_seeder --matched</w:t>
+      </w:r>
+    </w:p>
+    <w:p>
+      <w:pPr>
         <w:spacing w:before="80" w:after="160"/>
       </w:pPr>
       <w:r>
@@ -1531,7 +1586,67 @@
     </w:p>
     <w:p>
       <w:r>
-        <w:t>Les deux cohortes utilisent des bases SQLite distinctes (recherche.sqlite3 et recherche_tdbrain.sqlite3) et des modèles distincts : patients simulés et réels ne se mélangent jamais.</w:t>
+        <w:t>Les trois cohortes utilisent des bases SQLite distinctes (recherche.sqlite3, recherche_sim_matched.sqlite3 et recherche_tdbrain.sqlite3) et des modèles distincts : patients simulés et réels ne se mélangent jamais.</w:t>
+      </w:r>
+    </w:p>
+    <w:p>
+      <w:r>
+        <w:t>Pour entraîner les quatre modèles de la comparaison en une commande (deux cohortes × deux jeux de variables) :</w:t>
+      </w:r>
+    </w:p>
+    <w:p>
+      <w:pPr>
+        <w:spacing w:after="40"/>
+        <w:ind w:left="283"/>
+      </w:pPr>
+      <w:r>
+        <w:rPr>
+          <w:rFonts w:ascii="Consolas" w:hAnsi="Consolas"/>
+          <w:color w:val="333333"/>
+          <w:sz w:val="20"/>
+        </w:rPr>
+        <w:t>python -m src.models.train_all `</w:t>
+      </w:r>
+    </w:p>
+    <w:p>
+      <w:pPr>
+        <w:spacing w:after="40"/>
+        <w:ind w:left="283"/>
+      </w:pPr>
+      <w:r>
+        <w:rPr>
+          <w:rFonts w:ascii="Consolas" w:hAnsi="Consolas"/>
+          <w:color w:val="333333"/>
+          <w:sz w:val="20"/>
+        </w:rPr>
+        <w:t xml:space="preserve">    --root "data/tdbrain/TDBRAIN_Dataset_V3_1_Encr/TDBRAIN_Dataset_V3_1"</w:t>
+      </w:r>
+    </w:p>
+    <w:p>
+      <w:pPr>
+        <w:spacing w:after="40"/>
+        <w:ind w:left="283"/>
+      </w:pPr>
+      <w:r>
+        <w:rPr>
+          <w:rFonts w:ascii="Consolas" w:hAnsi="Consolas"/>
+          <w:color w:val="333333"/>
+          <w:sz w:val="20"/>
+        </w:rPr>
+      </w:r>
+    </w:p>
+    <w:p>
+      <w:pPr>
+        <w:spacing w:after="40"/>
+        <w:ind w:left="283"/>
+      </w:pPr>
+      <w:r>
+        <w:rPr>
+          <w:rFonts w:ascii="Consolas" w:hAnsi="Consolas"/>
+          <w:color w:val="333333"/>
+          <w:sz w:val="20"/>
+        </w:rPr>
+        <w:t>python -m src.models.train_all --sim-only   # sans la cohorte réelle</w:t>
       </w:r>
     </w:p>
     <w:p>
@@ -1899,6 +2014,50 @@
               <w:rPr>
                 <w:sz w:val="18"/>
               </w:rPr>
+              <w:t>recherche_sim_matched.sqlite3</w:t>
+            </w:r>
+          </w:p>
+        </w:tc>
+        <w:tc>
+          <w:tcPr>
+            <w:tcW w:type="dxa" w:w="2880"/>
+          </w:tcPr>
+          <w:p>
+            <w:r/>
+            <w:r>
+              <w:rPr>
+                <w:sz w:val="18"/>
+              </w:rPr>
+              <w:t>Non</w:t>
+            </w:r>
+          </w:p>
+        </w:tc>
+        <w:tc>
+          <w:tcPr>
+            <w:tcW w:type="dxa" w:w="2880"/>
+          </w:tcPr>
+          <w:p>
+            <w:r/>
+            <w:r>
+              <w:rPr>
+                <w:sz w:val="18"/>
+              </w:rPr>
+              <w:t>tdbrain_seeder --matched</w:t>
+            </w:r>
+          </w:p>
+        </w:tc>
+      </w:tr>
+      <w:tr>
+        <w:tc>
+          <w:tcPr>
+            <w:tcW w:type="dxa" w:w="2880"/>
+          </w:tcPr>
+          <w:p>
+            <w:r/>
+            <w:r>
+              <w:rPr>
+                <w:sz w:val="18"/>
+              </w:rPr>
               <w:t>recherche_tdbrain.sqlite3</w:t>
             </w:r>
           </w:p>
@@ -1987,7 +2146,7 @@
               <w:rPr>
                 <w:sz w:val="18"/>
               </w:rPr>
-              <w:t>data/models/tdbrain_response_v1.pt (+ .json)</w:t>
+              <w:t>data/models/sim_*.pt, tdbrain_*.pt (+ .json)</w:t>
             </w:r>
           </w:p>
         </w:tc>
@@ -2015,7 +2174,7 @@
               <w:rPr>
                 <w:sz w:val="18"/>
               </w:rPr>
-              <w:t>train_tdbrain</w:t>
+              <w:t>train_all</w:t>
             </w:r>
           </w:p>
         </w:tc>

</xml_diff>

<commit_message>
Rename the project to NeuroRéponse
The name now appears in the app title, both generated guides, and the README.
"Recherche-App" survives only as the on-disk working directory and in paths
that legitimately contain it (a notebook's stored output), plus one historical
note in CLAUDE.md so the old name stays searchable.

Repo is NeuroReponse without the accent — GitHub mangles accented characters.
Human-facing text uses NeuroRéponse.

Also fixes the home page's numbered list, which restarted at 6 because two
pages shared a line, and recaptures all 25 screenshots against the renamed app.

Co-Authored-By: Claude Opus 5 (1M context) <noreply@anthropic.com>
Claude-Session: https://claude.ai/code/session_017jcSZYdWo8hWwo9qMJPR6x
</commit_message>
<xml_diff>
--- a/docs/Guide_Installation.docx
+++ b/docs/Guide_Installation.docx
@@ -23,7 +23,7 @@
         <w:rPr>
           <w:sz w:val="28"/>
         </w:rPr>
-        <w:t>Application Recherche-App — rTMS + LSTM (EEG / ECG)</w:t>
+        <w:t>NeuroRéponse — application rTMS + LSTM (EEG / ECG)</w:t>
       </w:r>
     </w:p>
     <w:p>
@@ -599,7 +599,7 @@
           <w:color w:val="333333"/>
           <w:sz w:val="20"/>
         </w:rPr>
-        <w:t>git clone &lt;url-du-depot&gt; Recherche-App</w:t>
+        <w:t>git clone &lt;url-du-depot&gt; NeuroReponse</w:t>
       </w:r>
     </w:p>
     <w:p>
@@ -613,7 +613,7 @@
           <w:color w:val="333333"/>
           <w:sz w:val="20"/>
         </w:rPr>
-        <w:t>cd Recherche-App</w:t>
+        <w:t>cd NeuroReponse</w:t>
       </w:r>
     </w:p>
     <w:p>

</xml_diff>